<commit_message>
RP1: Anexa 13 – Lider- Asociația GAL Napoca Porolissum, subactivități doar coduri, corelate cu fișele de pontaj
Co-Authored-By: Claude Fable 5.1 <noreply@anthropic.com>
Claude-Session: https://claude.ai/code/session_012QEyjEiofXrzDsiwvcgQSU
</commit_message>
<xml_diff>
--- a/RP1_UNIC_352704/livrabile/Anexa 13_Lista experti_RP 1_UNIC_352704.docx
+++ b/RP1_UNIC_352704/livrabile/Anexa 13_Lista experti_RP 1_UNIC_352704.docx
@@ -1468,7 +1468,7 @@
                 <w:rFonts w:ascii="Trebuchet MS" w:hAnsi="Trebuchet MS" w:eastAsia="Trebuchet MS"/>
                 <w:sz w:val="24"/>
               </w:rPr>
-              <w:t>Lider – Asociația Grupul de Acțiune Locală Napoca Porolissum</w:t>
+              <w:t>Lider- Asociația Grupul de Acțiune Locală Napoca Porolissum</w:t>
             </w:r>
           </w:p>
         </w:tc>
@@ -1745,7 +1745,7 @@
                 <w:rFonts w:ascii="Trebuchet MS" w:hAnsi="Trebuchet MS" w:eastAsia="Trebuchet MS"/>
                 <w:sz w:val="24"/>
               </w:rPr>
-              <w:t>Lider – Asociația Grupul de Acțiune Locală Napoca Porolissum</w:t>
+              <w:t>Lider- Asociația Grupul de Acțiune Locală Napoca Porolissum</w:t>
             </w:r>
           </w:p>
         </w:tc>
@@ -2022,7 +2022,7 @@
                 <w:rFonts w:ascii="Trebuchet MS" w:hAnsi="Trebuchet MS" w:eastAsia="Trebuchet MS"/>
                 <w:sz w:val="24"/>
               </w:rPr>
-              <w:t>Lider – Asociația Grupul de Acțiune Locală Napoca Porolissum</w:t>
+              <w:t>Lider- Asociația Grupul de Acțiune Locală Napoca Porolissum</w:t>
             </w:r>
           </w:p>
         </w:tc>
@@ -2299,7 +2299,7 @@
                 <w:rFonts w:ascii="Trebuchet MS" w:hAnsi="Trebuchet MS" w:eastAsia="Trebuchet MS"/>
                 <w:sz w:val="24"/>
               </w:rPr>
-              <w:t>Lider – Asociația Grupul de Acțiune Locală Napoca Porolissum</w:t>
+              <w:t>Lider- Asociația Grupul de Acțiune Locală Napoca Porolissum</w:t>
             </w:r>
           </w:p>
         </w:tc>
@@ -2335,7 +2335,7 @@
                 <w:rFonts w:ascii="Trebuchet MS" w:hAnsi="Trebuchet MS" w:eastAsia="Trebuchet MS"/>
                 <w:sz w:val="24"/>
               </w:rPr>
-              <w:t>S.A.1.1; S.A.3.1</w:t>
+              <w:t>S.A.1.1</w:t>
             </w:r>
           </w:p>
         </w:tc>
@@ -2576,7 +2576,7 @@
                 <w:rFonts w:ascii="Trebuchet MS" w:hAnsi="Trebuchet MS" w:eastAsia="Trebuchet MS"/>
                 <w:sz w:val="24"/>
               </w:rPr>
-              <w:t>Lider – Asociația Grupul de Acțiune Locală Napoca Porolissum</w:t>
+              <w:t>Lider- Asociația Grupul de Acțiune Locală Napoca Porolissum</w:t>
             </w:r>
           </w:p>
         </w:tc>
@@ -2612,7 +2612,7 @@
                 <w:rFonts w:ascii="Trebuchet MS" w:hAnsi="Trebuchet MS" w:eastAsia="Trebuchet MS"/>
                 <w:sz w:val="24"/>
               </w:rPr>
-              <w:t>S.A.1.1; S.A.3.1</w:t>
+              <w:t>S.A.1.1</w:t>
             </w:r>
           </w:p>
         </w:tc>
@@ -2853,7 +2853,7 @@
                 <w:rFonts w:ascii="Trebuchet MS" w:hAnsi="Trebuchet MS" w:eastAsia="Trebuchet MS"/>
                 <w:sz w:val="24"/>
               </w:rPr>
-              <w:t>Lider – Asociația Grupul de Acțiune Locală Napoca Porolissum</w:t>
+              <w:t>Lider- Asociația Grupul de Acțiune Locală Napoca Porolissum</w:t>
             </w:r>
           </w:p>
         </w:tc>
@@ -2889,7 +2889,7 @@
                 <w:rFonts w:ascii="Trebuchet MS" w:hAnsi="Trebuchet MS" w:eastAsia="Trebuchet MS"/>
                 <w:sz w:val="24"/>
               </w:rPr>
-              <w:t>S.A.1.1; S.A.3.1</w:t>
+              <w:t>S.A.1.1</w:t>
             </w:r>
           </w:p>
         </w:tc>
@@ -3130,7 +3130,7 @@
                 <w:rFonts w:ascii="Trebuchet MS" w:hAnsi="Trebuchet MS" w:eastAsia="Trebuchet MS"/>
                 <w:sz w:val="24"/>
               </w:rPr>
-              <w:t>Lider – Asociația Grupul de Acțiune Locală Napoca Porolissum</w:t>
+              <w:t>Lider- Asociația Grupul de Acțiune Locală Napoca Porolissum</w:t>
             </w:r>
           </w:p>
         </w:tc>
@@ -3407,7 +3407,7 @@
                 <w:rFonts w:ascii="Trebuchet MS" w:hAnsi="Trebuchet MS" w:eastAsia="Trebuchet MS"/>
                 <w:sz w:val="24"/>
               </w:rPr>
-              <w:t>Lider – Asociația Grupul de Acțiune Locală Napoca Porolissum</w:t>
+              <w:t>Lider- Asociația Grupul de Acțiune Locală Napoca Porolissum</w:t>
             </w:r>
           </w:p>
         </w:tc>
@@ -3684,7 +3684,7 @@
                 <w:rFonts w:ascii="Trebuchet MS" w:hAnsi="Trebuchet MS" w:eastAsia="Trebuchet MS"/>
                 <w:sz w:val="24"/>
               </w:rPr>
-              <w:t>Lider – Asociația Grupul de Acțiune Locală Napoca Porolissum</w:t>
+              <w:t>Lider- Asociația Grupul de Acțiune Locală Napoca Porolissum</w:t>
             </w:r>
           </w:p>
         </w:tc>
@@ -3961,7 +3961,7 @@
                 <w:rFonts w:ascii="Trebuchet MS" w:hAnsi="Trebuchet MS" w:eastAsia="Trebuchet MS"/>
                 <w:sz w:val="24"/>
               </w:rPr>
-              <w:t>Lider – Asociația Grupul de Acțiune Locală Napoca Porolissum</w:t>
+              <w:t>Lider- Asociația Grupul de Acțiune Locală Napoca Porolissum</w:t>
             </w:r>
           </w:p>
         </w:tc>
@@ -3997,7 +3997,7 @@
                 <w:rFonts w:ascii="Trebuchet MS" w:hAnsi="Trebuchet MS" w:eastAsia="Trebuchet MS"/>
                 <w:sz w:val="24"/>
               </w:rPr>
-              <w:t>S.A.4.1; S.A.5.1</w:t>
+              <w:t>S.A.4.1; S.A.4.2; S.A.5.1</w:t>
             </w:r>
           </w:p>
         </w:tc>
@@ -4238,7 +4238,7 @@
                 <w:rFonts w:ascii="Trebuchet MS" w:hAnsi="Trebuchet MS" w:eastAsia="Trebuchet MS"/>
                 <w:sz w:val="24"/>
               </w:rPr>
-              <w:t>Lider – Asociația Grupul de Acțiune Locală Napoca Porolissum</w:t>
+              <w:t>Lider- Asociația Grupul de Acțiune Locală Napoca Porolissum</w:t>
             </w:r>
           </w:p>
         </w:tc>
@@ -4274,7 +4274,7 @@
                 <w:rFonts w:ascii="Trebuchet MS" w:hAnsi="Trebuchet MS" w:eastAsia="Trebuchet MS"/>
                 <w:sz w:val="24"/>
               </w:rPr>
-              <w:t>S.A.4.1; S.A.4.2</w:t>
+              <w:t>S.A.4.2</w:t>
             </w:r>
           </w:p>
         </w:tc>
@@ -4515,7 +4515,7 @@
                 <w:rFonts w:ascii="Trebuchet MS" w:hAnsi="Trebuchet MS" w:eastAsia="Trebuchet MS"/>
                 <w:sz w:val="24"/>
               </w:rPr>
-              <w:t>Lider – Asociația Grupul de Acțiune Locală Napoca Porolissum</w:t>
+              <w:t>Lider- Asociația Grupul de Acțiune Locală Napoca Porolissum</w:t>
             </w:r>
           </w:p>
         </w:tc>
@@ -4792,7 +4792,7 @@
                 <w:rFonts w:ascii="Trebuchet MS" w:hAnsi="Trebuchet MS" w:eastAsia="Trebuchet MS"/>
                 <w:sz w:val="24"/>
               </w:rPr>
-              <w:t>Lider – Asociația Grupul de Acțiune Locală Napoca Porolissum</w:t>
+              <w:t>Lider- Asociația Grupul de Acțiune Locală Napoca Porolissum</w:t>
             </w:r>
           </w:p>
         </w:tc>
@@ -5069,7 +5069,7 @@
                 <w:rFonts w:ascii="Trebuchet MS" w:hAnsi="Trebuchet MS" w:eastAsia="Trebuchet MS"/>
                 <w:sz w:val="24"/>
               </w:rPr>
-              <w:t>Lider – Asociația Grupul de Acțiune Locală Napoca Porolissum</w:t>
+              <w:t>Lider- Asociația Grupul de Acțiune Locală Napoca Porolissum</w:t>
             </w:r>
           </w:p>
         </w:tc>
@@ -5105,7 +5105,7 @@
                 <w:rFonts w:ascii="Trebuchet MS" w:hAnsi="Trebuchet MS" w:eastAsia="Trebuchet MS"/>
                 <w:sz w:val="24"/>
               </w:rPr>
-              <w:t>S.A.4.1; S.A.4.2; S.A.5.1</w:t>
+              <w:t>S.A.4.2</w:t>
             </w:r>
           </w:p>
         </w:tc>
@@ -5346,7 +5346,7 @@
                 <w:rFonts w:ascii="Trebuchet MS" w:hAnsi="Trebuchet MS" w:eastAsia="Trebuchet MS"/>
                 <w:sz w:val="24"/>
               </w:rPr>
-              <w:t>Lider – Asociația Grupul de Acțiune Locală Napoca Porolissum</w:t>
+              <w:t>Lider- Asociația Grupul de Acțiune Locală Napoca Porolissum</w:t>
             </w:r>
           </w:p>
         </w:tc>
@@ -5623,7 +5623,7 @@
                 <w:rFonts w:ascii="Trebuchet MS" w:hAnsi="Trebuchet MS" w:eastAsia="Trebuchet MS"/>
                 <w:sz w:val="24"/>
               </w:rPr>
-              <w:t>Lider – Asociația Grupul de Acțiune Locală Napoca Porolissum</w:t>
+              <w:t>Lider- Asociația Grupul de Acțiune Locală Napoca Porolissum</w:t>
             </w:r>
           </w:p>
         </w:tc>
@@ -5900,7 +5900,7 @@
                 <w:rFonts w:ascii="Trebuchet MS" w:hAnsi="Trebuchet MS" w:eastAsia="Trebuchet MS"/>
                 <w:sz w:val="24"/>
               </w:rPr>
-              <w:t>Lider – Asociația Grupul de Acțiune Locală Napoca Porolissum</w:t>
+              <w:t>Lider- Asociația Grupul de Acțiune Locală Napoca Porolissum</w:t>
             </w:r>
           </w:p>
         </w:tc>
@@ -6177,7 +6177,7 @@
                 <w:rFonts w:ascii="Trebuchet MS" w:hAnsi="Trebuchet MS" w:eastAsia="Trebuchet MS"/>
                 <w:sz w:val="24"/>
               </w:rPr>
-              <w:t>Lider – Asociația Grupul de Acțiune Locală Napoca Porolissum</w:t>
+              <w:t>Lider- Asociația Grupul de Acțiune Locală Napoca Porolissum</w:t>
             </w:r>
           </w:p>
         </w:tc>
@@ -6454,7 +6454,7 @@
                 <w:rFonts w:ascii="Trebuchet MS" w:hAnsi="Trebuchet MS" w:eastAsia="Trebuchet MS"/>
                 <w:sz w:val="24"/>
               </w:rPr>
-              <w:t>Lider – Asociația Grupul de Acțiune Locală Napoca Porolissum</w:t>
+              <w:t>Lider- Asociația Grupul de Acțiune Locală Napoca Porolissum</w:t>
             </w:r>
           </w:p>
         </w:tc>
@@ -6490,7 +6490,7 @@
                 <w:rFonts w:ascii="Trebuchet MS" w:hAnsi="Trebuchet MS" w:eastAsia="Trebuchet MS"/>
                 <w:sz w:val="24"/>
               </w:rPr>
-              <w:t>S.A.5.4</w:t>
+              <w:t>S.A.4.2; S.A.5.1; S.A.5.4</w:t>
             </w:r>
           </w:p>
         </w:tc>
@@ -6731,7 +6731,7 @@
                 <w:rFonts w:ascii="Trebuchet MS" w:hAnsi="Trebuchet MS" w:eastAsia="Trebuchet MS"/>
                 <w:sz w:val="24"/>
               </w:rPr>
-              <w:t>Lider – Asociația Grupul de Acțiune Locală Napoca Porolissum</w:t>
+              <w:t>Lider- Asociația Grupul de Acțiune Locală Napoca Porolissum</w:t>
             </w:r>
           </w:p>
         </w:tc>
@@ -6767,7 +6767,7 @@
                 <w:rFonts w:ascii="Trebuchet MS" w:hAnsi="Trebuchet MS" w:eastAsia="Trebuchet MS"/>
                 <w:sz w:val="24"/>
               </w:rPr>
-              <w:t>S.A.5.4</w:t>
+              <w:t>S.A.4.2; S.A.5.4</w:t>
             </w:r>
           </w:p>
         </w:tc>
@@ -7008,7 +7008,7 @@
                 <w:rFonts w:ascii="Trebuchet MS" w:hAnsi="Trebuchet MS" w:eastAsia="Trebuchet MS"/>
                 <w:sz w:val="24"/>
               </w:rPr>
-              <w:t>Lider – Asociația Grupul de Acțiune Locală Napoca Porolissum</w:t>
+              <w:t>Lider- Asociația Grupul de Acțiune Locală Napoca Porolissum</w:t>
             </w:r>
           </w:p>
         </w:tc>

</xml_diff>